<commit_message>
Filings can wait: trigger rule replaces file-now; seven IP value plays
</commit_message>
<xml_diff>
--- a/research/TRADEMARK_COST_BENEFIT_2026-08-12.docx
+++ b/research/TRADEMARK_COST_BENEFIT_2026-08-12.docx
@@ -35,18 +35,59 @@
         <w:spacing w:after="140"/>
       </w:pPr>
       <w:r>
-        <w:t xml:space="preserve">Short answer</w:t>
-      </w:r>
-    </w:p>
-    <w:p>
-      <w:pPr>
-        <w:spacing w:after="140"/>
-      </w:pPr>
-      <w:r>
-        <w:rPr>
-          <w:b/>
-        </w:rPr>
-        <w:t xml:space="preserve">Yes, file. But file $700 worth, not $1,050. Both marks in Class 042 only. Drop Class 035.</w:t>
+        <w:t xml:space="preserve">SUPERSEDED 2026-08-13: file on a trigger, not now</w:t>
+      </w:r>
+    </w:p>
+    <w:p>
+      <w:pPr>
+        <w:spacing w:after="140"/>
+      </w:pPr>
+      <w:r>
+        <w:rPr>
+          <w:b/>
+        </w:rPr>
+        <w:t xml:space="preserve">The owner pushed back on filing now and he was right.</w:t>
+      </w:r>
+      <w:r>
+        <w:t xml:space="preserve"> An intent-to-use application cannot be freely assigned before a Statement of Use, so filing now creates an asset that is harder to transfer cleanly during a sale, and a buyer's own filing would carry stronger bona fide intent than his. </w:t>
+      </w:r>
+      <w:r>
+        <w:rPr>
+          <w:b/>
+        </w:rPr>
+        <w:t xml:space="preserve">File only when one of three triggers fires: a buyer asks, he decides to commercialize, or a quarterly USPTO check shows someone filing close.</w:t>
+      </w:r>
+      <w:r>
+        <w:t xml:space="preserve"> See </w:t>
+      </w:r>
+      <w:r>
+        <w:rPr>
+          <w:rFonts w:ascii="Consolas" w:hAnsi="Consolas"/>
+        </w:rPr>
+        <w:t xml:space="preserve">research/IP_VALUE_PLAYS_2026-08-13.md</w:t>
+      </w:r>
+      <w:r>
+        <w:t xml:space="preserve">. The class and cost analysis below stands and applies whenever a trigger does fire.</w:t>
+      </w:r>
+    </w:p>
+    <w:p>
+      <w:pPr>
+        <w:pStyle w:val="Heading2"/>
+        <w:spacing w:after="140"/>
+      </w:pPr>
+      <w:r>
+        <w:t xml:space="preserve">Original short answer, superseded on timing only</w:t>
+      </w:r>
+    </w:p>
+    <w:p>
+      <w:pPr>
+        <w:spacing w:after="140"/>
+      </w:pPr>
+      <w:r>
+        <w:rPr>
+          <w:b/>
+        </w:rPr>
+        <w:t xml:space="preserve">File $700 worth, not $1,050. Both marks in Class 042 only. Drop Class 035.</w:t>
       </w:r>
     </w:p>
     <w:p>

</xml_diff>